<commit_message>
fix(C1798): remap LP slide references onto the converted 208-slide deck
The lab-alignment table and the schedule tables still carried the WSQ parent's
slide numbers, which are wrong after 10 slides were dropped — every lab entry
was off by 8 and the topic ranges pointed mid-lab.

Lab entry slides remapped through the kept-slide map and spot-checked against
the deck (21 -> Lab 01 practice bridge, 194 -> Lab 15). Topic ranges set to the
deck's real TOPIC section dividers (10/48/86/124/165) rather than a mechanical
shift, so each range starts on its own section slide.

scan_prohibited.py still PASS; both days still 450 min teaching ending 5:30pm.

Co-Authored-By: Claude Opus 5 <noreply@anthropic.com>
</commit_message>
<xml_diff>
--- a/courseware/LP-Agentic AI for Digital Marketing and Advertising (C1798).docx
+++ b/courseware/LP-Agentic AI for Digital Marketing and Advertising (C1798).docx
@@ -980,7 +980,7 @@
           </w:tcPr>
           <w:p>
             <w:r>
-              <w:t>Welcome, trainer profiles, course outcomes and safety boundaries — Slides 2–12</w:t>
+              <w:t>Welcome, trainer profiles, course outcomes and safety boundaries — Slides 1–9</w:t>
             </w:r>
           </w:p>
         </w:tc>
@@ -1026,7 +1026,7 @@
           </w:tcPr>
           <w:p>
             <w:r>
-              <w:t>Topic 1 mechanisms: research contract, evidence lineage, source scoring and audience signals — Slides 13–47</w:t>
+              <w:t>Topic 1 mechanisms: research contract, evidence lineage, source scoring and audience signals — Slides 10–47</w:t>
             </w:r>
           </w:p>
         </w:tc>
@@ -1164,7 +1164,7 @@
           </w:tcPr>
           <w:p>
             <w:r>
-              <w:t>Topic 2 mechanisms: RACE/SOSTAC, KPI contracts, ROI and attribution — Slides 48–86</w:t>
+              <w:t>Topic 2 mechanisms: RACE/SOSTAC, KPI contracts, ROI and attribution — Slides 48–85</w:t>
             </w:r>
           </w:p>
         </w:tc>
@@ -1256,7 +1256,7 @@
           </w:tcPr>
           <w:p>
             <w:r>
-              <w:t>Topic 3 mechanisms and Labs 7–8: content contracts and multi-channel factory — Slides 87–116</w:t>
+              <w:t>Topic 3 mechanisms and Labs 7–8: content contracts and multi-channel factory — Slides 86–123</w:t>
             </w:r>
           </w:p>
         </w:tc>
@@ -1533,7 +1533,7 @@
           </w:tcPr>
           <w:p>
             <w:r>
-              <w:t>Topic 4 mechanisms: approval state, payload binding and safe publishing — Slides 117–156</w:t>
+              <w:t>Topic 4 mechanisms: approval state, payload binding and safe publishing — Slides 124–164</w:t>
             </w:r>
           </w:p>
         </w:tc>
@@ -1717,7 +1717,7 @@
           </w:tcPr>
           <w:p>
             <w:r>
-              <w:t>Topic 5 mechanisms: event contracts, attribution and optimisation — Slides 157–196</w:t>
+              <w:t>Topic 5 mechanisms: event contracts, attribution and optimisation — Slides 165–204</w:t>
             </w:r>
           </w:p>
         </w:tc>
@@ -1887,7 +1887,7 @@
           </w:tcPr>
           <w:p>
             <w:r>
-              <w:t>29</w:t>
+              <w:t>21</w:t>
             </w:r>
           </w:p>
         </w:tc>
@@ -1929,7 +1929,7 @@
           </w:tcPr>
           <w:p>
             <w:r>
-              <w:t>38</w:t>
+              <w:t>30</w:t>
             </w:r>
           </w:p>
         </w:tc>
@@ -1971,7 +1971,7 @@
           </w:tcPr>
           <w:p>
             <w:r>
-              <w:t>47</w:t>
+              <w:t>39</w:t>
             </w:r>
           </w:p>
         </w:tc>
@@ -2013,7 +2013,7 @@
           </w:tcPr>
           <w:p>
             <w:r>
-              <w:t>67</w:t>
+              <w:t>59</w:t>
             </w:r>
           </w:p>
         </w:tc>
@@ -2055,7 +2055,7 @@
           </w:tcPr>
           <w:p>
             <w:r>
-              <w:t>76</w:t>
+              <w:t>68</w:t>
             </w:r>
           </w:p>
         </w:tc>
@@ -2097,7 +2097,7 @@
           </w:tcPr>
           <w:p>
             <w:r>
-              <w:t>85</w:t>
+              <w:t>77</w:t>
             </w:r>
           </w:p>
         </w:tc>
@@ -2139,7 +2139,7 @@
           </w:tcPr>
           <w:p>
             <w:r>
-              <w:t>105</w:t>
+              <w:t>97</w:t>
             </w:r>
           </w:p>
         </w:tc>
@@ -2181,7 +2181,7 @@
           </w:tcPr>
           <w:p>
             <w:r>
-              <w:t>114</w:t>
+              <w:t>106</w:t>
             </w:r>
           </w:p>
         </w:tc>
@@ -2223,7 +2223,7 @@
           </w:tcPr>
           <w:p>
             <w:r>
-              <w:t>123</w:t>
+              <w:t>115</w:t>
             </w:r>
           </w:p>
         </w:tc>
@@ -2265,7 +2265,7 @@
           </w:tcPr>
           <w:p>
             <w:r>
-              <w:t>146</w:t>
+              <w:t>138</w:t>
             </w:r>
           </w:p>
         </w:tc>
@@ -2307,7 +2307,7 @@
           </w:tcPr>
           <w:p>
             <w:r>
-              <w:t>155</w:t>
+              <w:t>147</w:t>
             </w:r>
           </w:p>
         </w:tc>
@@ -2349,7 +2349,7 @@
           </w:tcPr>
           <w:p>
             <w:r>
-              <w:t>164</w:t>
+              <w:t>156</w:t>
             </w:r>
           </w:p>
         </w:tc>
@@ -2391,7 +2391,7 @@
           </w:tcPr>
           <w:p>
             <w:r>
-              <w:t>184</w:t>
+              <w:t>176</w:t>
             </w:r>
           </w:p>
         </w:tc>
@@ -2433,7 +2433,7 @@
           </w:tcPr>
           <w:p>
             <w:r>
-              <w:t>193</w:t>
+              <w:t>185</w:t>
             </w:r>
           </w:p>
         </w:tc>
@@ -2475,7 +2475,7 @@
           </w:tcPr>
           <w:p>
             <w:r>
-              <w:t>202</w:t>
+              <w:t>194</w:t>
             </w:r>
           </w:p>
         </w:tc>

</xml_diff>